<commit_message>
fixed link to documents
</commit_message>
<xml_diff>
--- a/docs/SCW18-squid3_meeting_report.docx
+++ b/docs/SCW18-squid3_meeting_report.docx
@@ -149,13 +149,13 @@
         <w:pStyle w:val="BodyText"/>
       </w:pPr>
       <w:r>
-        <w:t xml:space="preserve">08 June 2026</w:t>
+        <w:t xml:space="preserve">09 June 2026</w:t>
       </w:r>
       <w:r>
         <w:t xml:space="preserve"> </w:t>
       </w:r>
       <w:r>
-        <w:t xml:space="preserve">15:28 CEST</w:t>
+        <w:t xml:space="preserve">22:43 CEST</w:t>
       </w:r>
     </w:p>
     <w:bookmarkStart w:id="12" w:name="summary"/>

</xml_diff>